<commit_message>
docs(plan): +2 QA items verified live (comment→notification, report→admin review) — 192 marks
</commit_message>
<xml_diff>
--- a/docs/Awj_Development_and_Launch_Plan.docx
+++ b/docs/Awj_Development_and_Launch_Plan.docx
@@ -4532,7 +4532,7 @@
         <w:bidi w:val="1"/>
       </w:pPr>
       <w:r>
-        <w:t>[ ] Community post → comment → notification.</w:t>
+        <w:t>[✓] Community post → comment → notification.</w:t>
       </w:r>
     </w:p>
     <w:p>
@@ -4542,7 +4542,7 @@
         <w:bidi w:val="1"/>
       </w:pPr>
       <w:r>
-        <w:t>[ ] Report content → Admin review.</w:t>
+        <w:t>[✓] Report content → Admin review.</w:t>
       </w:r>
     </w:p>
     <w:p>

</xml_diff>